<commit_message>
Republish thesis artifacts without blank chapter pages
</commit_message>
<xml_diff>
--- a/thesis/output/VEGO-AI-MSc-Thesis-Evidence-Ready-Draft-2026-07-24.docx
+++ b/thesis/output/VEGO-AI-MSc-Thesis-Evidence-Ready-Draft-2026-07-24.docx
@@ -82,7 +82,7 @@
         <w:br/>
         <w:t>24 July 2026</w:t>
         <w:br/>
-        <w:t>Source revision e9b70837dfc7</w:t>
+        <w:t>Source revision f19ccb698849</w:t>
       </w:r>
     </w:p>
     <w:p>
@@ -1090,6 +1090,7 @@
     <w:p>
       <w:pPr>
         <w:pStyle w:val="Heading1"/>
+        <w:pageBreakBefore w:val="0"/>
       </w:pPr>
       <w:r>
         <w:t>Abstract</w:t>
@@ -1159,16 +1160,12 @@
       </w:r>
       <w:r>
         <w:t xml:space="preserve"> human-AI collaboration, reusable human judgment, domain model assessment, variability interpretation, design-science research, VEGO-AI, human-in-the-loop</w:t>
-      </w:r>
-    </w:p>
-    <w:p>
-      <w:r>
-        <w:br w:type="page"/>
       </w:r>
     </w:p>
     <w:p>
       <w:pPr>
         <w:pStyle w:val="Heading1"/>
+        <w:pageBreakBefore/>
       </w:pPr>
       <w:r>
         <w:t>Chapter 1  -  Introduction</w:t>
@@ -1679,13 +1676,9 @@
       </w:r>
     </w:p>
     <w:p>
-      <w:r>
-        <w:br w:type="page"/>
-      </w:r>
-    </w:p>
-    <w:p>
       <w:pPr>
         <w:pStyle w:val="Heading1"/>
+        <w:pageBreakBefore/>
       </w:pPr>
       <w:r>
         <w:t>Chapter 2  -  Background and Related Work</w:t>
@@ -3521,13 +3514,9 @@
       </w:r>
     </w:p>
     <w:p>
-      <w:r>
-        <w:br w:type="page"/>
-      </w:r>
-    </w:p>
-    <w:p>
       <w:pPr>
         <w:pStyle w:val="Heading1"/>
+        <w:pageBreakBefore/>
       </w:pPr>
       <w:r>
         <w:t>Chapter 3  -  Problem Definition and Research Questions</w:t>
@@ -5631,13 +5620,9 @@
       </w:pPr>
     </w:p>
     <w:p>
-      <w:r>
-        <w:br w:type="page"/>
-      </w:r>
-    </w:p>
-    <w:p>
       <w:pPr>
         <w:pStyle w:val="Heading1"/>
+        <w:pageBreakBefore/>
       </w:pPr>
       <w:r>
         <w:t>Chapter 4  -  The VEGO-AI Baseline Pipeline (C0)</w:t>
@@ -7421,13 +7406,9 @@
       </w:r>
     </w:p>
     <w:p>
-      <w:r>
-        <w:br w:type="page"/>
-      </w:r>
-    </w:p>
-    <w:p>
       <w:pPr>
         <w:pStyle w:val="Heading1"/>
+        <w:pageBreakBefore/>
       </w:pPr>
       <w:r>
         <w:t>Chapter 5  -  The Human-AI Co-Reasoning Artifact (M1-M4B-1)</w:t>
@@ -10881,13 +10862,9 @@
       </w:r>
     </w:p>
     <w:p>
-      <w:r>
-        <w:br w:type="page"/>
-      </w:r>
-    </w:p>
-    <w:p>
       <w:pPr>
         <w:pStyle w:val="Heading1"/>
+        <w:pageBreakBefore/>
       </w:pPr>
       <w:r>
         <w:t>Chapter 6  -  Evaluation Methodology</w:t>
@@ -15503,13 +15480,9 @@
       </w:r>
     </w:p>
     <w:p>
-      <w:r>
-        <w:br w:type="page"/>
-      </w:r>
-    </w:p>
-    <w:p>
       <w:pPr>
         <w:pStyle w:val="Heading1"/>
+        <w:pageBreakBefore/>
       </w:pPr>
       <w:r>
         <w:t>Chapter 7  -  Experimental Results and Current Evidence</w:t>
@@ -20635,13 +20608,9 @@
       </w:r>
     </w:p>
     <w:p>
-      <w:r>
-        <w:br w:type="page"/>
-      </w:r>
-    </w:p>
-    <w:p>
       <w:pPr>
         <w:pStyle w:val="Heading1"/>
+        <w:pageBreakBefore/>
       </w:pPr>
       <w:r>
         <w:t>Chapter 8  -  Threats to Validity</w:t>
@@ -21378,13 +21347,9 @@
       </w:r>
     </w:p>
     <w:p>
-      <w:r>
-        <w:br w:type="page"/>
-      </w:r>
-    </w:p>
-    <w:p>
       <w:pPr>
         <w:pStyle w:val="Heading1"/>
+        <w:pageBreakBefore/>
       </w:pPr>
       <w:r>
         <w:t>Chapter 9  -  Discussion</w:t>
@@ -22931,13 +22896,9 @@
       </w:r>
     </w:p>
     <w:p>
-      <w:r>
-        <w:br w:type="page"/>
-      </w:r>
-    </w:p>
-    <w:p>
       <w:pPr>
         <w:pStyle w:val="Heading1"/>
+        <w:pageBreakBefore/>
       </w:pPr>
       <w:r>
         <w:t>Chapter 10  -  Conclusion and PhD Continuation</w:t>
@@ -23351,13 +23312,9 @@
       </w:r>
     </w:p>
     <w:p>
-      <w:r>
-        <w:br w:type="page"/>
-      </w:r>
-    </w:p>
-    <w:p>
       <w:pPr>
         <w:pStyle w:val="Heading1"/>
+        <w:pageBreakBefore/>
       </w:pPr>
       <w:r>
         <w:t>Chapter  -  Toward a Design Theory of Governed Human-Judgment Reuse in AI-Assisted Model Assessment</w:t>
@@ -25070,13 +25027,9 @@
       </w:r>
     </w:p>
     <w:p>
-      <w:r>
-        <w:br w:type="page"/>
-      </w:r>
-    </w:p>
-    <w:p>
       <w:pPr>
         <w:pStyle w:val="Heading1"/>
+        <w:pageBreakBefore/>
       </w:pPr>
       <w:r>
         <w:t>References</w:t>
@@ -25598,16 +25551,12 @@
       </w:r>
       <w:r>
         <w:t>.</w:t>
-      </w:r>
-    </w:p>
-    <w:p>
-      <w:r>
-        <w:br w:type="page"/>
       </w:r>
     </w:p>
     <w:p>
       <w:pPr>
         <w:pStyle w:val="Heading1"/>
+        <w:pageBreakBefore/>
       </w:pPr>
       <w:r>
         <w:t>Appendix A  -  Supplementary Materials</w:t>
@@ -31101,7 +31050,7 @@
         <w:color w:val="596573"/>
         <w:sz w:val="17"/>
       </w:rPr>
-      <w:t xml:space="preserve">   |   source e9b70837</w:t>
+      <w:t xml:space="preserve">   |   source f19ccb69</w:t>
     </w:r>
   </w:p>
 </w:hdr>

</xml_diff>

<commit_message>
Republish thesis package with portable figure assets
</commit_message>
<xml_diff>
--- a/thesis/output/VEGO-AI-MSc-Thesis-Evidence-Ready-Draft-2026-07-24.docx
+++ b/thesis/output/VEGO-AI-MSc-Thesis-Evidence-Ready-Draft-2026-07-24.docx
@@ -82,7 +82,7 @@
         <w:br/>
         <w:t>24 July 2026</w:t>
         <w:br/>
-        <w:t>Source revision f19ccb698849</w:t>
+        <w:t>Source revision adc56a3ccfec</w:t>
       </w:r>
     </w:p>
     <w:p>
@@ -31050,7 +31050,7 @@
         <w:color w:val="596573"/>
         <w:sz w:val="17"/>
       </w:rPr>
-      <w:t xml:space="preserve">   |   source f19ccb69</w:t>
+      <w:t xml:space="preserve">   |   source adc56a3c</w:t>
     </w:r>
   </w:p>
 </w:hdr>

</xml_diff>

<commit_message>
Rebase thesis provenance on squash revision
</commit_message>
<xml_diff>
--- a/thesis/output/VEGO-AI-MSc-Thesis-Evidence-Ready-Draft-2026-07-24.docx
+++ b/thesis/output/VEGO-AI-MSc-Thesis-Evidence-Ready-Draft-2026-07-24.docx
@@ -82,7 +82,7 @@
         <w:br/>
         <w:t>24 July 2026</w:t>
         <w:br/>
-        <w:t>Source revision adc56a3ccfec</w:t>
+        <w:t>Source revision 279646cb1ba4</w:t>
       </w:r>
     </w:p>
     <w:p>
@@ -31050,7 +31050,7 @@
         <w:color w:val="596573"/>
         <w:sz w:val="17"/>
       </w:rPr>
-      <w:t xml:space="preserve">   |   source adc56a3c</w:t>
+      <w:t xml:space="preserve">   |   source 279646cb</w:t>
     </w:r>
   </w:p>
 </w:hdr>

</xml_diff>